<commit_message>
Chapter 5 and report: corrections that match the test code, semicolons removed
Chapter 5 and the report now describe the tests and the audit log as the
code does: the creation test uses a doctor DID without a valid doctor
credential, the reload test checks the stored approval, attack A5 is no
longer listed as a creation test, and the creation log entry holds the
consent identifier and timestamp. Section 5.1 now says the contract was
deployed through MetaMask and that the doctor and each guardian hold a role
credential. Semicolons in the chapter text and in Tables 5.2 and 5.4 are
replaced with full stops or commas. The figure descriptions are updated.

The RED_changes files show each old wording struck through in red with the
new wording after it in red. The clean files and the combined Chapters 1-5
and 1-6 files carry the same text without colour.

Co-Authored-By: Claude Opus 5.5 <noreply@anthropic.com>
Claude-Session: https://claude.ai/code/session_01QHSSv245Aernyaebt7V5kS
</commit_message>
<xml_diff>
--- a/docs/Yasir_Thesis_Chapter5_clean.docx
+++ b/docs/Yasir_Thesis_Chapter5_clean.docx
@@ -92,7 +92,13 @@
     <w:p>
       <w:pPr/>
       <w:r>
-        <w:t>In this chapter, firstly the research architecture on which the whole framework is built is presented. There are three layers in the architecture, and the role of each layer is explained in this chapter. Furthermore, a model is proposed to represent patient consent as an evaluable authorisation object; this provides a complete solution to research objective 1. In this chapter, we also present the results of the validation of the proposed solution to research question one. To validate this research question, we built the HALAH prototype and used the following technologies to test the system:</w:t>
+        <w:t xml:space="preserve">In this chapter, firstly the research architecture on which the whole framework is built is presented. There are three layers in the architecture, and the role of each layer is explained in this chapter. Furthermore, a model is proposed to represent patient consent as an evaluable authorisation object</w:t>
+      </w:r>
+      <w:r>
+        <w:t xml:space="preserve">. This provides</w:t>
+      </w:r>
+      <w:r>
+        <w:t xml:space="preserve"> a complete solution to research objective 1. In this chapter, we also present the results of the validation of the proposed solution to research question one. To validate this research question, we built the HALAH prototype and used the following technologies to test the system:</w:t>
       </w:r>
     </w:p>
     <w:p>
@@ -114,7 +120,19 @@
         <w:t xml:space="preserve">Blockchain: </w:t>
       </w:r>
       <w:r>
-        <w:t>A blockchain is a decentralised and distributed ledger in which a recorded entry cannot be altered retroactively without altering the blocks that follow it (Wood 2014). In HALAH the chain holds no medical content; it anchors only the state of an approved consent, as a soulbound token (Cai 2022) that cannot be transferred, and its revocation. The Ethereum test network Sepolia (Ethereum Foundation 2026b) was chosen because it runs the same virtual machine as the main network, so the contract behaves as it would in production, while its ether has no monetary value. The contract was deployed and its transactions sent through the MetaMask wallet (Consensys 2026), and every transaction is publicly visible on Etherscan.</w:t>
+        <w:t xml:space="preserve">A blockchain is a decentralised and distributed ledger in which a recorded entry cannot be altered retroactively without altering the blocks that follow it (Wood 2014). In HALAH the chain holds no medical content</w:t>
+      </w:r>
+      <w:r>
+        <w:t xml:space="preserve">. It anchors</w:t>
+      </w:r>
+      <w:r>
+        <w:t xml:space="preserve"> only the state of an approved consent, as a soulbound token (Cai 2022) that cannot be transferred, and its revocation. The Ethereum test network Sepolia (Ethereum Foundation 2026b) was chosen because it runs the same virtual machine as the main network, so the contract behaves as it would in production, while its ether has no monetary value. </w:t>
+      </w:r>
+      <w:r>
+        <w:t xml:space="preserve">The contract was deployed through</w:t>
+      </w:r>
+      <w:r>
+        <w:t xml:space="preserve"> the MetaMask wallet (Consensys 2026), and every transaction is publicly visible on Etherscan.</w:t>
       </w:r>
     </w:p>
     <w:p>
@@ -180,7 +198,13 @@
         <w:t xml:space="preserve">Decentralised identifiers and verifiable credentials: </w:t>
       </w:r>
       <w:r>
-        <w:t>Every participant is named by a decentralised identifier (W3C 2022) and holds a role credential (W3C 2025) signed by a trusted issuer, so the identity of a participant and the authority of that participant are verified as two separate conditions, as Chapter 6 presents.</w:t>
+        <w:t xml:space="preserve">Every participant is named by a decentralised identifier </w:t>
+      </w:r>
+      <w:r>
+        <w:t xml:space="preserve">(W3C 2022), and the doctor and each guardian hold a role credential</w:t>
+      </w:r>
+      <w:r>
+        <w:t xml:space="preserve"> (W3C 2025) signed by a trusted issuer, so the identity of a participant and the authority of that participant are verified as two separate conditions, as Chapter 6 presents.</w:t>
       </w:r>
     </w:p>
     <w:p>
@@ -739,7 +763,7 @@
           <wp:inline distT="0" distB="0" distL="0" distR="0" wp14:anchorId="4803924F" wp14:editId="4C10A961">
             <wp:extent cx="3676650" cy="5334000"/>
             <wp:effectExtent l="0" t="0" r="0" b="0"/>
-            <wp:docPr id="2086885382" name="F8.png" descr="Trust predicate evaluation and authorisation decision flow (in the current prototype, VI also checks the EIP-712 signature of each listed guardian, and a refusal for a consent that is not ACTIVE is recorded in the audit ledger like any other refusal, while the check labelled VL in the prototype interface is the exploratory jurisdiction check VJ)" title="Trust predicate evaluation and authorisation decision flow (in the current prototype, VI also checks the EIP-712 signature of each listed guardian, and a refusal for a consent that is not ACTIVE is recorded in the audit ledger like any other refusal, while the check labelled VL in the prototype interface is the exploratory jurisdiction check VJ)"/>
+            <wp:docPr id="2086885382" name="F8.png" descr="Trust predicate evaluation and authorisation decision flow" title="Trust predicate evaluation and authorisation decision flow"/>
             <wp:cNvGraphicFramePr>
               <a:graphicFrameLocks xmlns:a="http://schemas.openxmlformats.org/drawingml/2006/main" noChangeAspect="1"/>
             </wp:cNvGraphicFramePr>
@@ -2276,7 +2300,25 @@
                 <w:sz w:val="20"/>
                 <w:szCs w:val="17"/>
               </w:rPr>
-              <w:t>Central identity provider; institution login</w:t>
+              <w:t xml:space="preserve">Central identity provider</w:t>
+            </w:r>
+            <w:r>
+              <w:rPr>
+                <w:rFonts w:ascii="Palatino Linotype" w:hAnsi="Palatino Linotype" w:cs="Palatino Linotype"/>
+                <w:color w:val="000000"/>
+                <w:sz w:val="20"/>
+                <w:szCs w:val="17"/>
+              </w:rPr>
+              <w:t xml:space="preserve">,</w:t>
+            </w:r>
+            <w:r>
+              <w:rPr>
+                <w:rFonts w:ascii="Palatino Linotype" w:hAnsi="Palatino Linotype" w:cs="Palatino Linotype"/>
+                <w:color w:val="000000"/>
+                <w:sz w:val="20"/>
+                <w:szCs w:val="17"/>
+              </w:rPr>
+              <w:t xml:space="preserve"> institution login</w:t>
             </w:r>
           </w:p>
         </w:tc>
@@ -2312,7 +2354,25 @@
                 <w:sz w:val="20"/>
                 <w:szCs w:val="17"/>
               </w:rPr>
-              <w:t>A DID for every participant; identity kept separate from authority</w:t>
+              <w:t xml:space="preserve">A DID for every participant</w:t>
+            </w:r>
+            <w:r>
+              <w:rPr>
+                <w:rFonts w:ascii="Palatino Linotype" w:hAnsi="Palatino Linotype" w:cs="Palatino Linotype"/>
+                <w:color w:val="000000"/>
+                <w:sz w:val="20"/>
+                <w:szCs w:val="17"/>
+              </w:rPr>
+              <w:t xml:space="preserve">,</w:t>
+            </w:r>
+            <w:r>
+              <w:rPr>
+                <w:rFonts w:ascii="Palatino Linotype" w:hAnsi="Palatino Linotype" w:cs="Palatino Linotype"/>
+                <w:color w:val="000000"/>
+                <w:sz w:val="20"/>
+                <w:szCs w:val="17"/>
+              </w:rPr>
+              <w:t xml:space="preserve"> identity kept separate from authority</w:t>
             </w:r>
           </w:p>
         </w:tc>
@@ -2538,7 +2598,25 @@
                 <w:sz w:val="20"/>
                 <w:szCs w:val="17"/>
               </w:rPr>
-              <w:t>All listed guardians sign (EIP-712); no single party can approve alone</w:t>
+              <w:t xml:space="preserve">All listed guardians sign (EIP-712)</w:t>
+            </w:r>
+            <w:r>
+              <w:rPr>
+                <w:rFonts w:ascii="Palatino Linotype" w:hAnsi="Palatino Linotype" w:cs="Palatino Linotype"/>
+                <w:color w:val="000000"/>
+                <w:sz w:val="20"/>
+                <w:szCs w:val="17"/>
+              </w:rPr>
+              <w:t xml:space="preserve">,</w:t>
+            </w:r>
+            <w:r>
+              <w:rPr>
+                <w:rFonts w:ascii="Palatino Linotype" w:hAnsi="Palatino Linotype" w:cs="Palatino Linotype"/>
+                <w:color w:val="000000"/>
+                <w:sz w:val="20"/>
+                <w:szCs w:val="17"/>
+              </w:rPr>
+              <w:t xml:space="preserve"> no single party can approve alone</w:t>
             </w:r>
           </w:p>
         </w:tc>
@@ -2764,7 +2842,25 @@
                 <w:sz w:val="20"/>
                 <w:szCs w:val="17"/>
               </w:rPr>
-              <w:t>Validity window and revocation checked each time; on-chain revoke</w:t>
+              <w:t xml:space="preserve">Validity window and revocation checked each time</w:t>
+            </w:r>
+            <w:r>
+              <w:rPr>
+                <w:rFonts w:ascii="Palatino Linotype" w:hAnsi="Palatino Linotype" w:cs="Palatino Linotype"/>
+                <w:color w:val="000000"/>
+                <w:sz w:val="20"/>
+                <w:szCs w:val="17"/>
+              </w:rPr>
+              <w:t xml:space="preserve">,</w:t>
+            </w:r>
+            <w:r>
+              <w:rPr>
+                <w:rFonts w:ascii="Palatino Linotype" w:hAnsi="Palatino Linotype" w:cs="Palatino Linotype"/>
+                <w:color w:val="000000"/>
+                <w:sz w:val="20"/>
+                <w:szCs w:val="17"/>
+              </w:rPr>
+              <w:t xml:space="preserve"> on-chain revoke</w:t>
             </w:r>
           </w:p>
         </w:tc>
@@ -2877,7 +2973,25 @@
                 <w:sz w:val="20"/>
                 <w:szCs w:val="17"/>
               </w:rPr>
-              <w:t>Every access decision, allowed or denied, logged off-chain with its decision matrix; consent state anchored on Sepolia</w:t>
+              <w:t xml:space="preserve">Every access decision, allowed or denied, logged off-chain with its decision matrix</w:t>
+            </w:r>
+            <w:r>
+              <w:rPr>
+                <w:rFonts w:ascii="Palatino Linotype" w:hAnsi="Palatino Linotype" w:cs="Palatino Linotype"/>
+                <w:color w:val="000000"/>
+                <w:sz w:val="20"/>
+                <w:szCs w:val="17"/>
+              </w:rPr>
+              <w:t xml:space="preserve">,</w:t>
+            </w:r>
+            <w:r>
+              <w:rPr>
+                <w:rFonts w:ascii="Palatino Linotype" w:hAnsi="Palatino Linotype" w:cs="Palatino Linotype"/>
+                <w:color w:val="000000"/>
+                <w:sz w:val="20"/>
+                <w:szCs w:val="17"/>
+              </w:rPr>
+              <w:t xml:space="preserve"> consent state anchored on Sepolia</w:t>
             </w:r>
           </w:p>
         </w:tc>
@@ -3137,7 +3251,7 @@
           <wp:inline distT="0" distB="0" distL="0" distR="0" wp14:anchorId="7ADA6155" wp14:editId="26D4F596">
             <wp:extent cx="5715000" cy="3162300"/>
             <wp:effectExtent l="0" t="0" r="0" b="0"/>
-            <wp:docPr id="71915820" name="F11.png" descr="Six-component consent model C = (I, A, P, T, L, E) with the content and supplier of each component, where L is the lifecycle state. The states shown are those of the design, and the states implemented in the prototype are given in Section 10.3" title="Six-component consent model C = (I, A, P, T, L, E) with the content and supplier of each component, where L is the lifecycle state. The states shown are those of the design, and the states implemented in the prototype are given in Section 10.3"/>
+            <wp:docPr id="71915820" name="F11.png" descr="Six-component consent model C = (I, A, P, T, L, E) with the content and supplier of each component, where L is the lifecycle state. The states shown are those of the design, and the states implemented in the prototype are given in Chapter 9" title="Six-component consent model C = (I, A, P, T, L, E) with the content and supplier of each component, where L is the lifecycle state. The states shown are those of the design, and the states implemented in the prototype are given in Chapter 9"/>
             <wp:cNvGraphicFramePr>
               <a:graphicFrameLocks xmlns:a="http://schemas.openxmlformats.org/drawingml/2006/main" noChangeAspect="1"/>
             </wp:cNvGraphicFramePr>
@@ -4323,7 +4437,13 @@
     <w:p>
       <w:pPr/>
       <w:r>
-        <w:t>We used the Ethereum test network Sepolia as the computing platform for the on-chain part of the prototype, and Solidity as its programming language (Ethereum Foundation 2026a). Sepolia was chosen because it runs the same virtual machine as the Ethereum main network, so the contract and its transactions behave as they would in production, while its ether has no monetary value, which allowed the mint and revoke transactions to be repeated during development. The prototype is not engineered for throughput or for a production deployment; its purpose is to validate the design.</w:t>
+        <w:t xml:space="preserve">We used the Ethereum test network Sepolia as the computing platform for the on-chain part of the prototype, and Solidity as its programming language (Ethereum Foundation 2026a). Sepolia was chosen because it runs the same virtual machine as the Ethereum main network, so the contract and its transactions behave as they would in production, while its ether has no monetary value, which allowed the mint and revoke transactions to be repeated during development. The prototype is not engineered for throughput or for a production deployment</w:t>
+      </w:r>
+      <w:r>
+        <w:t xml:space="preserve">. Its purpose</w:t>
+      </w:r>
+      <w:r>
+        <w:t xml:space="preserve"> is to validate the design.</w:t>
       </w:r>
     </w:p>
     <w:p>
@@ -5436,7 +5556,13 @@
     <w:p>
       <w:pPr/>
       <w:r>
-        <w:t>Objective one involves the representation of patient consent as an evaluable authorisation object. The result of RO1 is therefore the conceptual model of Sections 5.2 to 5.5, not a set of measurements. The prototype results reported in this section show only that the model can be realised and behaves as specified, so they are reported as outcomes, created or rejected, rather than as numbers; the quantitative evaluation of the complete framework is given in Chapter 10. The results of the validation carried out for this objective are shown in Figure 5.8 and Table 5.4, and the security properties of the architecture are examined in Table 5.5. RO1 is validated in two ways. First, the creation of the consent object is checked functionally: a valid specification must produce a consent object with all six components, and an invalid specification must be rejected before anything is stored. Second, the architecture is evaluated against the security properties it is designed to provide. The validation of the predicates that are evaluated against the consent object, VI, VA, VP, VT and VL, belongs to the chapters of RO2 to RO5, and the evaluation of the complete decision belongs to Chapter 10.</w:t>
+        <w:t xml:space="preserve">Objective one involves the representation of patient consent as an evaluable authorisation object. The result of RO1 is therefore the conceptual model of Sections 5.2 to 5.5, not a set of measurements. The prototype results reported in this section show only that the model can be realised and behaves as specified, so they are reported as outcomes, created or rejected, rather than as numbers</w:t>
+      </w:r>
+      <w:r>
+        <w:t xml:space="preserve">. The quantitative</w:t>
+      </w:r>
+      <w:r>
+        <w:t xml:space="preserve"> evaluation of the complete framework is given in Chapter 10. The results of the validation carried out for this objective are shown in Figure 5.8 and Table 5.4, and the security properties of the architecture are examined in Table 5.5. RO1 is validated in two ways. First, the creation of the consent object is checked functionally: a valid specification must produce a consent object with all six components, and an invalid specification must be rejected before anything is stored. Second, the architecture is evaluated against the security properties it is designed to provide. The validation of the predicates that are evaluated against the consent object, VI, VA, VP, VT and VL, belongs to the chapters of RO2 to RO5, and the evaluation of the complete decision belongs to Chapter 10.</w:t>
       </w:r>
     </w:p>
     <w:p>
@@ -5463,7 +5589,25 @@
     <w:p>
       <w:pPr/>
       <w:r>
-        <w:t>Automated tests. Two tests cover consent creation. The test test_patient_form_checks_the_doctor_and_the_guardians drives the patient form itself: it submits a malformed doctor DID, a guardian without a credential and a duplicate guardian, and asserts that each is refused with the right message, then submits a valid specification and asserts that the consent is created and logged. The test test_consent_persists_across_reload stores a consent, adds an approval, reloads the store from disk and asserts that the stored object is unchanged. The adversarial test A5 (test_A5_empty_scope_is_rejected) belongs to RO4 but also exercises the creation rule that the data scope must not be empty. All of these tests pass in the suite of 46 reported in Chapter 10.</w:t>
+        <w:t xml:space="preserve">Automated tests. Two tests cover consent creation. The test test_patient_form_checks_the_doctor_and_the_guardians drives the patient form itself: it submits </w:t>
+      </w:r>
+      <w:r>
+        <w:t xml:space="preserve">a doctor DID without a valid doctor credential</w:t>
+      </w:r>
+      <w:r>
+        <w:t xml:space="preserve">, a guardian without a credential and a duplicate guardian, and asserts that each is refused with the right message, then submits a valid specification and asserts that the consent is created and logged. The test test_consent_persists_across_reload stores a consent, adds an approval, reloads the store from disk and asserts that </w:t>
+      </w:r>
+      <w:r>
+        <w:t xml:space="preserve">the stored approval is unchanged</w:t>
+      </w:r>
+      <w:r>
+        <w:t xml:space="preserve">. </w:t>
+      </w:r>
+      <w:r>
+        <w:t xml:space="preserve">Both tests pass</w:t>
+      </w:r>
+      <w:r>
+        <w:t xml:space="preserve"> in the suite of 46 reported in Chapter 10.</w:t>
       </w:r>
     </w:p>
     <w:p>
@@ -5865,7 +6009,23 @@
                 <w:color w:val="000000"/>
                 <w:sz w:val="20"/>
               </w:rPr>
-              <w:t>Identifiers without a valid credential rejected before anything is stored; valid identifiers holding valid credentials accepted.</w:t>
+              <w:t xml:space="preserve">Identifiers without a valid credential rejected before anything is stored</w:t>
+            </w:r>
+            <w:r>
+              <w:rPr>
+                <w:rFonts w:ascii="Palatino Linotype" w:hAnsi="Palatino Linotype" w:cs="Palatino Linotype"/>
+                <w:color w:val="000000"/>
+                <w:sz w:val="20"/>
+              </w:rPr>
+              <w:t xml:space="preserve">. Valid</w:t>
+            </w:r>
+            <w:r>
+              <w:rPr>
+                <w:rFonts w:ascii="Palatino Linotype" w:hAnsi="Palatino Linotype" w:cs="Palatino Linotype"/>
+                <w:color w:val="000000"/>
+                <w:sz w:val="20"/>
+              </w:rPr>
+              <w:t xml:space="preserve"> identifiers holding valid credentials accepted.</w:t>
             </w:r>
           </w:p>
         </w:tc>
@@ -5942,7 +6102,23 @@
                 <w:color w:val="000000"/>
                 <w:sz w:val="20"/>
               </w:rPr>
-              <w:t>Steps 3 and 7: the guardian set G, and the threshold N derived from it as |G|; no guardian may appear twice.</w:t>
+              <w:t xml:space="preserve">Steps 3 and 7: the guardian set G, and the threshold N derived from it as |G|</w:t>
+            </w:r>
+            <w:r>
+              <w:rPr>
+                <w:rFonts w:ascii="Palatino Linotype" w:hAnsi="Palatino Linotype" w:cs="Palatino Linotype"/>
+                <w:color w:val="000000"/>
+                <w:sz w:val="20"/>
+              </w:rPr>
+              <w:t xml:space="preserve">. No guardian</w:t>
+            </w:r>
+            <w:r>
+              <w:rPr>
+                <w:rFonts w:ascii="Palatino Linotype" w:hAnsi="Palatino Linotype" w:cs="Palatino Linotype"/>
+                <w:color w:val="000000"/>
+                <w:sz w:val="20"/>
+              </w:rPr>
+              <w:t xml:space="preserve"> may appear twice.</w:t>
             </w:r>
           </w:p>
         </w:tc>
@@ -6014,7 +6190,23 @@
                 <w:color w:val="000000"/>
                 <w:sz w:val="20"/>
               </w:rPr>
-              <w:t>Duplicate guardian rejected; consent created with N set to the number of guardians.</w:t>
+              <w:t xml:space="preserve">Duplicate guardian rejected</w:t>
+            </w:r>
+            <w:r>
+              <w:rPr>
+                <w:rFonts w:ascii="Palatino Linotype" w:hAnsi="Palatino Linotype" w:cs="Palatino Linotype"/>
+                <w:color w:val="000000"/>
+                <w:sz w:val="20"/>
+              </w:rPr>
+              <w:t xml:space="preserve">. Consent created</w:t>
+            </w:r>
+            <w:r>
+              <w:rPr>
+                <w:rFonts w:ascii="Palatino Linotype" w:hAnsi="Palatino Linotype" w:cs="Palatino Linotype"/>
+                <w:color w:val="000000"/>
+                <w:sz w:val="20"/>
+              </w:rPr>
+              <w:t xml:space="preserve"> with N set to the number of guardians.</w:t>
             </w:r>
           </w:p>
         </w:tc>
@@ -6091,7 +6283,23 @@
                 <w:color w:val="000000"/>
                 <w:sz w:val="20"/>
               </w:rPr>
-              <w:t>Steps 4 and 5: the purpose and the data scope; the data scope must not be empty.</w:t>
+              <w:t xml:space="preserve">Steps 4 and 5: the purpose and the data scope</w:t>
+            </w:r>
+            <w:r>
+              <w:rPr>
+                <w:rFonts w:ascii="Palatino Linotype" w:hAnsi="Palatino Linotype" w:cs="Palatino Linotype"/>
+                <w:color w:val="000000"/>
+                <w:sz w:val="20"/>
+              </w:rPr>
+              <w:t xml:space="preserve">. The data scope must</w:t>
+            </w:r>
+            <w:r>
+              <w:rPr>
+                <w:rFonts w:ascii="Palatino Linotype" w:hAnsi="Palatino Linotype" w:cs="Palatino Linotype"/>
+                <w:color w:val="000000"/>
+                <w:sz w:val="20"/>
+              </w:rPr>
+              <w:t xml:space="preserve"> not be empty.</w:t>
             </w:r>
           </w:p>
         </w:tc>
@@ -6127,7 +6335,23 @@
                 <w:color w:val="000000"/>
                 <w:sz w:val="20"/>
               </w:rPr>
-              <w:t>Adversarial test A5 (test_A5_empty_scope_is_rejected). Scenario 1 recorded the four data modules and the purpose Treatment; the purpose vocabulary check is exercised by the automated tests.</w:t>
+              <w:t xml:space="preserve">Scenario 1 recorded the four data modules and the purpose Treatment</w:t>
+            </w:r>
+            <w:r>
+              <w:rPr>
+                <w:rFonts w:ascii="Palatino Linotype" w:hAnsi="Palatino Linotype" w:cs="Palatino Linotype"/>
+                <w:color w:val="000000"/>
+                <w:sz w:val="20"/>
+              </w:rPr>
+              <w:t xml:space="preserve">. The purpose vocabulary</w:t>
+            </w:r>
+            <w:r>
+              <w:rPr>
+                <w:rFonts w:ascii="Palatino Linotype" w:hAnsi="Palatino Linotype" w:cs="Palatino Linotype"/>
+                <w:color w:val="000000"/>
+                <w:sz w:val="20"/>
+              </w:rPr>
+              <w:t xml:space="preserve"> check is exercised by the automated tests.</w:t>
             </w:r>
           </w:p>
         </w:tc>
@@ -6163,7 +6387,23 @@
                 <w:color w:val="000000"/>
                 <w:sz w:val="20"/>
               </w:rPr>
-              <w:t>Empty scope rejected; purpose and scope recorded in the consent object.</w:t>
+              <w:t xml:space="preserve">Empty scope rejected</w:t>
+            </w:r>
+            <w:r>
+              <w:rPr>
+                <w:rFonts w:ascii="Palatino Linotype" w:hAnsi="Palatino Linotype" w:cs="Palatino Linotype"/>
+                <w:color w:val="000000"/>
+                <w:sz w:val="20"/>
+              </w:rPr>
+              <w:t xml:space="preserve">. Purpose and scope</w:t>
+            </w:r>
+            <w:r>
+              <w:rPr>
+                <w:rFonts w:ascii="Palatino Linotype" w:hAnsi="Palatino Linotype" w:cs="Palatino Linotype"/>
+                <w:color w:val="000000"/>
+                <w:sz w:val="20"/>
+              </w:rPr>
+              <w:t xml:space="preserve"> recorded in the consent object.</w:t>
             </w:r>
           </w:p>
         </w:tc>
@@ -6240,7 +6480,23 @@
                 <w:color w:val="000000"/>
                 <w:sz w:val="20"/>
               </w:rPr>
-              <w:t>Step 6: the validity interval T = (ts, te); the expiry time must be later than the start time.</w:t>
+              <w:t xml:space="preserve">Step 6: the validity interval T = (ts, te)</w:t>
+            </w:r>
+            <w:r>
+              <w:rPr>
+                <w:rFonts w:ascii="Palatino Linotype" w:hAnsi="Palatino Linotype" w:cs="Palatino Linotype"/>
+                <w:color w:val="000000"/>
+                <w:sz w:val="20"/>
+              </w:rPr>
+              <w:t xml:space="preserve">. The expiry time</w:t>
+            </w:r>
+            <w:r>
+              <w:rPr>
+                <w:rFonts w:ascii="Palatino Linotype" w:hAnsi="Palatino Linotype" w:cs="Palatino Linotype"/>
+                <w:color w:val="000000"/>
+                <w:sz w:val="20"/>
+              </w:rPr>
+              <w:t xml:space="preserve"> must be later than the start time.</w:t>
             </w:r>
           </w:p>
         </w:tc>
@@ -6276,7 +6532,23 @@
                 <w:color w:val="000000"/>
                 <w:sz w:val="20"/>
               </w:rPr>
-              <w:t>Scenario 1 recorded a validity window ending on 31 December 2026; the prototype refuses an expiry time that is not later than the start time (Section 5.8).</w:t>
+              <w:t xml:space="preserve">Scenario 1 recorded a validity window ending on 31 December 2026</w:t>
+            </w:r>
+            <w:r>
+              <w:rPr>
+                <w:rFonts w:ascii="Palatino Linotype" w:hAnsi="Palatino Linotype" w:cs="Palatino Linotype"/>
+                <w:color w:val="000000"/>
+                <w:sz w:val="20"/>
+              </w:rPr>
+              <w:t xml:space="preserve">. The prototype refuses</w:t>
+            </w:r>
+            <w:r>
+              <w:rPr>
+                <w:rFonts w:ascii="Palatino Linotype" w:hAnsi="Palatino Linotype" w:cs="Palatino Linotype"/>
+                <w:color w:val="000000"/>
+                <w:sz w:val="20"/>
+              </w:rPr>
+              <w:t xml:space="preserve"> an expiry time that is not later than the start time (Section 5.8).</w:t>
             </w:r>
           </w:p>
         </w:tc>
@@ -6312,7 +6584,23 @@
                 <w:color w:val="000000"/>
                 <w:sz w:val="20"/>
               </w:rPr>
-              <w:t>Validity interval recorded; the interval is enforced at every request by VT (Chapter 9).</w:t>
+              <w:t xml:space="preserve">Validity interval recorded</w:t>
+            </w:r>
+            <w:r>
+              <w:rPr>
+                <w:rFonts w:ascii="Palatino Linotype" w:hAnsi="Palatino Linotype" w:cs="Palatino Linotype"/>
+                <w:color w:val="000000"/>
+                <w:sz w:val="20"/>
+              </w:rPr>
+              <w:t xml:space="preserve">. The interval</w:t>
+            </w:r>
+            <w:r>
+              <w:rPr>
+                <w:rFonts w:ascii="Palatino Linotype" w:hAnsi="Palatino Linotype" w:cs="Palatino Linotype"/>
+                <w:color w:val="000000"/>
+                <w:sz w:val="20"/>
+              </w:rPr>
+              <w:t xml:space="preserve"> is enforced at every request by VT (Chapter 9).</w:t>
             </w:r>
           </w:p>
         </w:tc>
@@ -6425,7 +6713,23 @@
                 <w:color w:val="000000"/>
                 <w:sz w:val="20"/>
               </w:rPr>
-              <w:t>Consents f050c29a, 04da25f5 and 18ab9b62 were created in PENDING_SIGNATURE. Test test_consent_persists_across_reload: the stored object, including its state, is unchanged after a reload from disk.</w:t>
+              <w:t xml:space="preserve">Consents f050c29a, 04da25f5 and 18ab9b62 were created in PENDING_SIGNATURE. Test test_consent_persists_across_reload: </w:t>
+            </w:r>
+            <w:r>
+              <w:rPr>
+                <w:rFonts w:ascii="Palatino Linotype" w:hAnsi="Palatino Linotype" w:cs="Palatino Linotype"/>
+                <w:color w:val="000000"/>
+                <w:sz w:val="20"/>
+              </w:rPr>
+              <w:t xml:space="preserve">the stored approval is unchanged</w:t>
+            </w:r>
+            <w:r>
+              <w:rPr>
+                <w:rFonts w:ascii="Palatino Linotype" w:hAnsi="Palatino Linotype" w:cs="Palatino Linotype"/>
+                <w:color w:val="000000"/>
+                <w:sz w:val="20"/>
+              </w:rPr>
+              <w:t xml:space="preserve"> after a reload from disk.</w:t>
             </w:r>
           </w:p>
         </w:tc>
@@ -6461,7 +6765,23 @@
                 <w:color w:val="000000"/>
                 <w:sz w:val="20"/>
               </w:rPr>
-              <w:t>Created in PENDING_SIGNATURE; no access is possible until the state is ACTIVE (Chapter 9).</w:t>
+              <w:t xml:space="preserve">Created in PENDING_SIGNATURE</w:t>
+            </w:r>
+            <w:r>
+              <w:rPr>
+                <w:rFonts w:ascii="Palatino Linotype" w:hAnsi="Palatino Linotype" w:cs="Palatino Linotype"/>
+                <w:color w:val="000000"/>
+                <w:sz w:val="20"/>
+              </w:rPr>
+              <w:t xml:space="preserve">. No access</w:t>
+            </w:r>
+            <w:r>
+              <w:rPr>
+                <w:rFonts w:ascii="Palatino Linotype" w:hAnsi="Palatino Linotype" w:cs="Palatino Linotype"/>
+                <w:color w:val="000000"/>
+                <w:sz w:val="20"/>
+              </w:rPr>
+              <w:t xml:space="preserve"> is possible until the state is ACTIVE (Chapter 9).</w:t>
             </w:r>
           </w:p>
         </w:tc>
@@ -6536,7 +6856,15 @@
                 <w:color w:val="000000"/>
                 <w:sz w:val="20"/>
               </w:rPr>
-              <w:t>Step 11: the CREATE_CONSENT event is written to the audit ledger with the consent identifier, participants and timestamp.</w:t>
+              <w:t xml:space="preserve">Step 11: the CREATE_CONSENT event is written to the audit ledger </w:t>
+            </w:r>
+            <w:r>
+              <w:rPr>
+                <w:rFonts w:ascii="Palatino Linotype" w:hAnsi="Palatino Linotype" w:cs="Palatino Linotype"/>
+                <w:color w:val="000000"/>
+                <w:sz w:val="20"/>
+              </w:rPr>
+              <w:t xml:space="preserve">with the consent identifier and timestamp.</w:t>
             </w:r>
           </w:p>
         </w:tc>
@@ -6606,7 +6934,23 @@
                 <w:color w:val="000000"/>
                 <w:sz w:val="20"/>
               </w:rPr>
-              <w:t>Every creation is logged; a rejected specification stores and logs nothing.</w:t>
+              <w:t xml:space="preserve">Every creation is logged</w:t>
+            </w:r>
+            <w:r>
+              <w:rPr>
+                <w:rFonts w:ascii="Palatino Linotype" w:hAnsi="Palatino Linotype" w:cs="Palatino Linotype"/>
+                <w:color w:val="000000"/>
+                <w:sz w:val="20"/>
+              </w:rPr>
+              <w:t xml:space="preserve">. A rejected</w:t>
+            </w:r>
+            <w:r>
+              <w:rPr>
+                <w:rFonts w:ascii="Palatino Linotype" w:hAnsi="Palatino Linotype" w:cs="Palatino Linotype"/>
+                <w:color w:val="000000"/>
+                <w:sz w:val="20"/>
+              </w:rPr>
+              <w:t xml:space="preserve"> specification stores and logs nothing.</w:t>
             </w:r>
           </w:p>
         </w:tc>
@@ -7475,7 +7819,13 @@
     <w:p>
       <w:pPr/>
       <w:r>
-        <w:t>Each property in Table 5.5 is realised by a component of the architecture and tested in a later chapter. Identity-dependent participation and authority separation are tested in Chapter 6 through the credential checks and the forged-credential attack. Multi-party authorisation integrity is tested in Chapter 7 through the outside-signer, replayed-signature and duplicate-approval attacks. Policy-bounded access is tested in Chapter 8 through the over-scope and empty-scope attacks. Authorisation evidence is checked in every chapter through the audit ledger and in Chapter 10 through the recorded decisions. Separation of interaction and enforcement is the property that the hardening of 1 October 2026 made real: three attacks that the interface already blocked were also accepted by the service functions until the checks were moved into the Controller, as reported in Chapter 10. The architecture therefore does not claim security from MVC itself; it claims it from the placement of every trust-sensitive check inside the Controller, and the tests of the following chapters are the evidence for that claim.</w:t>
+        <w:t xml:space="preserve">Each property in Table 5.5 is realised by a component of the architecture and tested in a later chapter. Identity-dependent participation and authority separation are tested in Chapter 6 through the credential checks and the forged-credential attack. Multi-party authorisation integrity is tested in Chapter 7 through the outside-signer, replayed-signature and duplicate-approval attacks. Policy-bounded access is tested in Chapter 8 through the over-scope and empty-scope attacks. Authorisation evidence is checked in every chapter through the audit ledger and in Chapter 10 through the recorded decisions. Separation of interaction and enforcement is the property that the hardening of 1 October 2026 made real: three attacks that the interface already blocked were also accepted by the service functions until the checks were moved into the Controller, as reported in Chapter 10. The architecture therefore does not claim security from MVC itself</w:t>
+      </w:r>
+      <w:r>
+        <w:t xml:space="preserve">. It claims</w:t>
+      </w:r>
+      <w:r>
+        <w:t xml:space="preserve"> it from the placement of every trust-sensitive check inside the Controller, and the tests of the following chapters are the evidence for that claim.</w:t>
       </w:r>
     </w:p>
     <w:p>
@@ -7490,7 +7840,13 @@
     <w:p>
       <w:pPr/>
       <w:r>
-        <w:t>The use of the consent object for consent creation has several advantages which include completeness, rejection before storage, and evidence. Completeness means that a created consent carries every condition that the later checks need, so no check has to look for its condition outside the object. Rejection before storage means that an invalid specification leaves no record behind, so the store never holds a consent that cannot be evaluated. Evidence means that every creation is written to the audit ledger with its identifier, its participants and its time, so the later decisions can be traced back to the consent they were taken on.</w:t>
+        <w:t xml:space="preserve">The use of the consent object for consent creation has several advantages which include completeness, rejection before storage, and evidence. Completeness means that a created consent carries every condition that the later checks need, so no check has to look for its condition outside the object. Rejection before storage means that an invalid specification leaves no record behind, so the store never holds a consent that cannot be evaluated. Evidence means that every creation is written to the audit ledger </w:t>
+      </w:r>
+      <w:r>
+        <w:t xml:space="preserve">with its identifier and its time</w:t>
+      </w:r>
+      <w:r>
+        <w:t xml:space="preserve">, so the later decisions can be traced back to the consent they were taken on.</w:t>
       </w:r>
     </w:p>
     <w:p>
@@ -7517,7 +7873,13 @@
     <w:p>
       <w:pPr/>
       <w:r>
-        <w:t>In this chapter we also presented the prototype used for validating the solution to research objective 1. This was done using a public synthetic dataset. At the end of the validation process, the results show that valid specifications are created with all six components and that invalid ones are rejected before anything is stored, and the architecture was evaluated against the six security properties it is designed to provide. However, a key finding from the validation was that a consent cannot be changed once it has been created; the users of HALAH will have to create a new consent when its terms change.</w:t>
+        <w:t xml:space="preserve">In this chapter we also presented the prototype used for validating the solution to research objective 1. This was done using a public synthetic dataset. At the end of the validation process, the results show that valid specifications are created with all six components and that invalid ones are rejected before anything is stored, and the architecture was evaluated against the six security properties it is designed to provide. However, a key finding from the validation was that a consent cannot be changed once it has been created</w:t>
+      </w:r>
+      <w:r>
+        <w:t xml:space="preserve">. The users</w:t>
+      </w:r>
+      <w:r>
+        <w:t xml:space="preserve"> of HALAH will have to create a new consent when its terms change.</w:t>
       </w:r>
     </w:p>
     <w:p>

</xml_diff>